<commit_message>
updated the evidence link
</commit_message>
<xml_diff>
--- a/Evidence/Custom_IComponentPropertyActivator_Validation_Report.docx
+++ b/Evidence/Custom_IComponentPropertyActivator_Validation_Report.docx
@@ -436,7 +436,7 @@
         <w:rPr>
           <w:rFonts w:cs="Arial"/>
         </w:rPr>
-        <w:t>d9006c69bbea336f0910af342090da8f6f280f6b</w:t>
+        <w:t>1bd976b717c16ab7bd175854262e8cf921c340a8</w:t>
       </w:r>
     </w:p>
     <w:p>
@@ -785,7 +785,7 @@
                   <w:sz w:val="28"/>
                   <w:szCs w:val="28"/>
                 </w:rPr>
-                <w:t>Custo</w:t>
+                <w:t>CustomActiv</w:t>
               </w:r>
               <w:r>
                 <w:rPr>
@@ -793,7 +793,7 @@
                   <w:sz w:val="28"/>
                   <w:szCs w:val="28"/>
                 </w:rPr>
-                <w:t>m</w:t>
+                <w:t>a</w:t>
               </w:r>
               <w:r>
                 <w:rPr>
@@ -801,23 +801,7 @@
                   <w:sz w:val="28"/>
                   <w:szCs w:val="28"/>
                 </w:rPr>
-                <w:t>Ac</w:t>
-              </w:r>
-              <w:r>
-                <w:rPr>
-                  <w:rStyle w:val="Hyperlink"/>
-                  <w:sz w:val="28"/>
-                  <w:szCs w:val="28"/>
-                </w:rPr>
-                <w:t>t</w:t>
-              </w:r>
-              <w:r>
-                <w:rPr>
-                  <w:rStyle w:val="Hyperlink"/>
-                  <w:sz w:val="28"/>
-                  <w:szCs w:val="28"/>
-                </w:rPr>
-                <w:t>ivator</w:t>
+                <w:t>tor</w:t>
               </w:r>
             </w:hyperlink>
             <w:r>
@@ -1344,7 +1328,23 @@
                   <w:sz w:val="28"/>
                   <w:szCs w:val="28"/>
                 </w:rPr>
-                <w:t>Activation_Failure</w:t>
+                <w:t>Activation_Fai</w:t>
+              </w:r>
+              <w:r>
+                <w:rPr>
+                  <w:rStyle w:val="Hyperlink"/>
+                  <w:sz w:val="28"/>
+                  <w:szCs w:val="28"/>
+                </w:rPr>
+                <w:t>l</w:t>
+              </w:r>
+              <w:r>
+                <w:rPr>
+                  <w:rStyle w:val="Hyperlink"/>
+                  <w:sz w:val="28"/>
+                  <w:szCs w:val="28"/>
+                </w:rPr>
+                <w:t>ure</w:t>
               </w:r>
               <w:proofErr w:type="spellEnd"/>
             </w:hyperlink>
@@ -1456,14 +1456,7 @@
                 <w:sz w:val="28"/>
                 <w:szCs w:val="28"/>
               </w:rPr>
-              <w:t>verify</w:t>
-            </w:r>
-            <w:r>
-              <w:rPr>
-                <w:sz w:val="28"/>
-                <w:szCs w:val="28"/>
-              </w:rPr>
-              <w:t xml:space="preserve"> deliberate activation exception. </w:t>
+              <w:t xml:space="preserve">verify deliberate activation exception. </w:t>
             </w:r>
           </w:p>
           <w:p>
@@ -1587,7 +1580,7 @@
                   <w:sz w:val="28"/>
                   <w:szCs w:val="28"/>
                 </w:rPr>
-                <w:t>Activation-failure</w:t>
+                <w:t>Activation-failure,</w:t>
               </w:r>
             </w:hyperlink>
             <w:r>
@@ -1595,7 +1588,7 @@
                 <w:sz w:val="28"/>
                 <w:szCs w:val="28"/>
               </w:rPr>
-              <w:t xml:space="preserve">, </w:t>
+              <w:t xml:space="preserve"> </w:t>
             </w:r>
             <w:hyperlink r:id="rId33" w:history="1">
               <w:r>
@@ -3435,6 +3428,11 @@
             <w:tcW w:w="3235" w:type="dxa"/>
           </w:tcPr>
           <w:p>
+            <w:pPr>
+              <w:rPr>
+                <w:rStyle w:val="Hyperlink"/>
+              </w:rPr>
+            </w:pPr>
             <w:r>
               <w:rPr>
                 <w:b/>
@@ -3444,25 +3442,57 @@
               </w:rPr>
               <w:t xml:space="preserve">Global Server: </w:t>
             </w:r>
-            <w:hyperlink r:id="rId78" w:history="1">
-              <w:r>
-                <w:rPr>
-                  <w:rStyle w:val="Hyperlink"/>
-                  <w:sz w:val="28"/>
-                  <w:szCs w:val="28"/>
-                </w:rPr>
-                <w:t>browser-refresh</w:t>
-              </w:r>
-            </w:hyperlink>
-          </w:p>
-          <w:p>
-            <w:pPr>
+            <w:r>
+              <w:rPr>
+                <w:sz w:val="28"/>
+                <w:szCs w:val="28"/>
+              </w:rPr>
+              <w:fldChar w:fldCharType="begin"/>
+            </w:r>
+            <w:r>
+              <w:rPr>
+                <w:sz w:val="28"/>
+                <w:szCs w:val="28"/>
+              </w:rPr>
+              <w:instrText>HYPERLINK "https://github.com/vendasankarsf3945/69177-Blazor-PropertyActivator-Validation/blob/1bd976b717c16ab7bd175854262e8cf921c340a8/Evidence/Screenshots/Interactive_Server/S07_BrowserRefresh.gif"</w:instrText>
+            </w:r>
+            <w:r>
+              <w:rPr>
+                <w:sz w:val="28"/>
+                <w:szCs w:val="28"/>
+              </w:rPr>
+            </w:r>
+            <w:r>
+              <w:rPr>
+                <w:sz w:val="28"/>
+                <w:szCs w:val="28"/>
+              </w:rPr>
+              <w:fldChar w:fldCharType="separate"/>
+            </w:r>
+            <w:r>
               <w:rPr>
                 <w:rStyle w:val="Hyperlink"/>
                 <w:sz w:val="28"/>
                 <w:szCs w:val="28"/>
               </w:rPr>
-            </w:pPr>
+              <w:t>browser-refresh</w:t>
+            </w:r>
+          </w:p>
+          <w:p>
+            <w:pPr>
+              <w:rPr>
+                <w:rStyle w:val="Hyperlink"/>
+                <w:sz w:val="28"/>
+                <w:szCs w:val="28"/>
+              </w:rPr>
+            </w:pPr>
+            <w:r>
+              <w:rPr>
+                <w:sz w:val="28"/>
+                <w:szCs w:val="28"/>
+              </w:rPr>
+              <w:fldChar w:fldCharType="end"/>
+            </w:r>
             <w:r>
               <w:rPr>
                 <w:b/>
@@ -3484,7 +3514,7 @@
                 <w:sz w:val="28"/>
                 <w:szCs w:val="28"/>
               </w:rPr>
-              <w:instrText>HYPERLINK "https://github.com/vendasankarsf3945/69177-Blazor-PropertyActivator-Validation/blob/d9006c69bbea336f0910af342090da8f6f280f6b/Evidence/Screenshots/Hosted_InteractiveWebAssembly/S07_BrowserRefresh.gif"</w:instrText>
+              <w:instrText>HYPERLINK "https://github.com/vendasankarsf3945/69177-Blazor-PropertyActivator-Validation/blob/1bd976b717c16ab7bd175854262e8cf921c340a8/Evidence/Screenshots/Hosted_InteractiveWebAssembly/S07_BrowserRefresh.gif"</w:instrText>
             </w:r>
             <w:r>
               <w:rPr>
@@ -3531,7 +3561,7 @@
               </w:rPr>
               <w:t xml:space="preserve">Standalone WASM: </w:t>
             </w:r>
-            <w:hyperlink r:id="rId79" w:history="1">
+            <w:hyperlink r:id="rId78" w:history="1">
               <w:r>
                 <w:rPr>
                   <w:rStyle w:val="Hyperlink"/>
@@ -4579,8 +4609,6 @@
             <w:proofErr w:type="spellStart"/>
             <w:r>
               <w:rPr>
-                <w:b/>
-                <w:bCs/>
                 <w:sz w:val="28"/>
                 <w:szCs w:val="28"/>
               </w:rPr>
@@ -4589,8 +4617,6 @@
             <w:proofErr w:type="spellEnd"/>
             <w:r>
               <w:rPr>
-                <w:b/>
-                <w:bCs/>
                 <w:sz w:val="28"/>
                 <w:szCs w:val="28"/>
               </w:rPr>
@@ -4725,8 +4751,6 @@
             </w:pPr>
             <w:r>
               <w:rPr>
-                <w:b/>
-                <w:bCs/>
                 <w:sz w:val="28"/>
                 <w:szCs w:val="28"/>
               </w:rPr>

</xml_diff>